<commit_message>
roman/feature: changed my files, deleted fifth student and added code directory
</commit_message>
<xml_diff>
--- a/40488199/40488199_GenAi_Log.docx
+++ b/40488199/40488199_GenAi_Log.docx
@@ -164,7 +164,7 @@
                 <w:sz w:val="18"/>
                 <w:szCs w:val="18"/>
               </w:rPr>
-              <w:t>7</w:t>
+              <w:t>1</w:t>
             </w:r>
           </w:p>
         </w:tc>
@@ -266,21 +266,7 @@
                 <w:sz w:val="18"/>
                 <w:szCs w:val="18"/>
               </w:rPr>
-              <w:t xml:space="preserve">Selected </w:t>
-            </w:r>
-            <w:r>
-              <w:rPr>
-                <w:sz w:val="18"/>
-                <w:szCs w:val="18"/>
-              </w:rPr>
-              <w:t xml:space="preserve">SDG 4 and found data source after what I had some </w:t>
-            </w:r>
-            <w:r>
-              <w:rPr>
-                <w:sz w:val="18"/>
-                <w:szCs w:val="18"/>
-              </w:rPr>
-              <w:t>ideas which I started describe in Individual Initial Design file</w:t>
+              <w:t>Selected SDG 4 based on my own interest in education, then independently found ITU data sources and began drafting my individual design</w:t>
             </w:r>
           </w:p>
         </w:tc>
@@ -311,7 +297,7 @@
                 <w:sz w:val="18"/>
                 <w:szCs w:val="18"/>
               </w:rPr>
-              <w:t>8</w:t>
+              <w:t>2</w:t>
             </w:r>
           </w:p>
         </w:tc>
@@ -355,7 +341,7 @@
                 <w:sz w:val="18"/>
                 <w:szCs w:val="18"/>
               </w:rPr>
-              <w:t>Learning</w:t>
+              <w:t>Writing support</w:t>
             </w:r>
           </w:p>
         </w:tc>
@@ -377,7 +363,7 @@
                 <w:sz w:val="18"/>
                 <w:szCs w:val="18"/>
               </w:rPr>
-              <w:t>Instructions how to use GitHub as a place for common space for collecting our files</w:t>
+              <w:t>Asked for help improving wording and structure of my Individual Design</w:t>
             </w:r>
           </w:p>
         </w:tc>
@@ -399,7 +385,35 @@
                 <w:sz w:val="18"/>
                 <w:szCs w:val="18"/>
               </w:rPr>
-              <w:t>Understood what to do to use one repository with group members, set up and manually created project structure</w:t>
+              <w:t xml:space="preserve">All design decisions, entity choices, and database structure </w:t>
+            </w:r>
+            <w:r>
+              <w:rPr>
+                <w:sz w:val="18"/>
+                <w:szCs w:val="18"/>
+              </w:rPr>
+              <w:t>are</w:t>
+            </w:r>
+            <w:r>
+              <w:rPr>
+                <w:sz w:val="18"/>
+                <w:szCs w:val="18"/>
+              </w:rPr>
+              <w:t xml:space="preserve"> my own</w:t>
+            </w:r>
+            <w:r>
+              <w:rPr>
+                <w:sz w:val="18"/>
+                <w:szCs w:val="18"/>
+              </w:rPr>
+              <w:t xml:space="preserve">, </w:t>
+            </w:r>
+            <w:r>
+              <w:rPr>
+                <w:sz w:val="18"/>
+                <w:szCs w:val="18"/>
+              </w:rPr>
+              <w:t>AI was used only to rephrase and check clarity of written</w:t>
             </w:r>
           </w:p>
         </w:tc>
@@ -423,7 +437,14 @@
                 <w:sz w:val="18"/>
                 <w:szCs w:val="18"/>
               </w:rPr>
-              <w:t>Week 9</w:t>
+              <w:t xml:space="preserve">Week </w:t>
+            </w:r>
+            <w:r>
+              <w:rPr>
+                <w:sz w:val="18"/>
+                <w:szCs w:val="18"/>
+              </w:rPr>
+              <w:t>3</w:t>
             </w:r>
           </w:p>
         </w:tc>
@@ -452,66 +473,63 @@
         <w:tc>
           <w:tcPr>
             <w:tcW w:w="745" w:type="pct"/>
-            <w:hideMark/>
-          </w:tcPr>
-          <w:p>
-            <w:pPr>
-              <w:pStyle w:val="NoSpacing"/>
-              <w:rPr>
-                <w:sz w:val="18"/>
-                <w:szCs w:val="18"/>
-              </w:rPr>
-            </w:pPr>
-            <w:r>
-              <w:rPr>
-                <w:sz w:val="18"/>
-                <w:szCs w:val="18"/>
-              </w:rPr>
-              <w:t>N/A</w:t>
+          </w:tcPr>
+          <w:p>
+            <w:pPr>
+              <w:pStyle w:val="NoSpacing"/>
+              <w:rPr>
+                <w:sz w:val="18"/>
+                <w:szCs w:val="18"/>
+              </w:rPr>
+            </w:pPr>
+            <w:r>
+              <w:rPr>
+                <w:sz w:val="18"/>
+                <w:szCs w:val="18"/>
+              </w:rPr>
+              <w:t>Learning</w:t>
             </w:r>
           </w:p>
         </w:tc>
         <w:tc>
           <w:tcPr>
             <w:tcW w:w="950" w:type="pct"/>
-            <w:hideMark/>
-          </w:tcPr>
-          <w:p>
-            <w:pPr>
-              <w:pStyle w:val="NoSpacing"/>
-              <w:rPr>
-                <w:sz w:val="18"/>
-                <w:szCs w:val="18"/>
-              </w:rPr>
-            </w:pPr>
-            <w:r>
-              <w:rPr>
-                <w:sz w:val="18"/>
-                <w:szCs w:val="18"/>
-              </w:rPr>
-              <w:t>N/A</w:t>
+          </w:tcPr>
+          <w:p>
+            <w:pPr>
+              <w:pStyle w:val="NoSpacing"/>
+              <w:rPr>
+                <w:sz w:val="18"/>
+                <w:szCs w:val="18"/>
+              </w:rPr>
+            </w:pPr>
+            <w:r>
+              <w:rPr>
+                <w:sz w:val="18"/>
+                <w:szCs w:val="18"/>
+              </w:rPr>
+              <w:t>Instructions how to use GitHub as a place for common space for collecting our files</w:t>
             </w:r>
           </w:p>
         </w:tc>
         <w:tc>
           <w:tcPr>
             <w:tcW w:w="2087" w:type="pct"/>
-            <w:hideMark/>
-          </w:tcPr>
-          <w:p>
-            <w:pPr>
-              <w:pStyle w:val="NoSpacing"/>
-              <w:rPr>
-                <w:sz w:val="18"/>
-                <w:szCs w:val="18"/>
-              </w:rPr>
-            </w:pPr>
-            <w:r>
-              <w:rPr>
-                <w:sz w:val="18"/>
-                <w:szCs w:val="18"/>
-              </w:rPr>
-              <w:t>No AI used this week</w:t>
+          </w:tcPr>
+          <w:p>
+            <w:pPr>
+              <w:pStyle w:val="NoSpacing"/>
+              <w:rPr>
+                <w:sz w:val="18"/>
+                <w:szCs w:val="18"/>
+              </w:rPr>
+            </w:pPr>
+            <w:r>
+              <w:rPr>
+                <w:sz w:val="18"/>
+                <w:szCs w:val="18"/>
+              </w:rPr>
+              <w:t>Understood what to do to use one repository with group members, set up and manually created project structure</w:t>
             </w:r>
           </w:p>
         </w:tc>
@@ -534,7 +552,14 @@
                 <w:sz w:val="18"/>
                 <w:szCs w:val="18"/>
               </w:rPr>
-              <w:t>Week 10</w:t>
+              <w:t xml:space="preserve">Week </w:t>
+            </w:r>
+            <w:r>
+              <w:rPr>
+                <w:sz w:val="18"/>
+                <w:szCs w:val="18"/>
+              </w:rPr>
+              <w:t>4</w:t>
             </w:r>
           </w:p>
         </w:tc>
@@ -571,6 +596,13 @@
                 <w:szCs w:val="18"/>
               </w:rPr>
             </w:pPr>
+            <w:r>
+              <w:rPr>
+                <w:sz w:val="18"/>
+                <w:szCs w:val="18"/>
+              </w:rPr>
+              <w:t>N/A</w:t>
+            </w:r>
           </w:p>
         </w:tc>
         <w:tc>
@@ -585,6 +617,13 @@
                 <w:szCs w:val="18"/>
               </w:rPr>
             </w:pPr>
+            <w:r>
+              <w:rPr>
+                <w:sz w:val="18"/>
+                <w:szCs w:val="18"/>
+              </w:rPr>
+              <w:t>N/A</w:t>
+            </w:r>
           </w:p>
         </w:tc>
         <w:tc>
@@ -599,6 +638,13 @@
                 <w:szCs w:val="18"/>
               </w:rPr>
             </w:pPr>
+            <w:r>
+              <w:rPr>
+                <w:sz w:val="18"/>
+                <w:szCs w:val="18"/>
+              </w:rPr>
+              <w:t>No AI used this week</w:t>
+            </w:r>
           </w:p>
         </w:tc>
       </w:tr>
@@ -620,7 +666,14 @@
                 <w:sz w:val="18"/>
                 <w:szCs w:val="18"/>
               </w:rPr>
-              <w:t>Week 11</w:t>
+              <w:t xml:space="preserve">Week </w:t>
+            </w:r>
+            <w:r>
+              <w:rPr>
+                <w:sz w:val="18"/>
+                <w:szCs w:val="18"/>
+              </w:rPr>
+              <w:t>5</w:t>
             </w:r>
           </w:p>
         </w:tc>
@@ -657,6 +710,13 @@
                 <w:szCs w:val="18"/>
               </w:rPr>
             </w:pPr>
+            <w:r>
+              <w:rPr>
+                <w:sz w:val="18"/>
+                <w:szCs w:val="18"/>
+              </w:rPr>
+              <w:t>N/A</w:t>
+            </w:r>
           </w:p>
         </w:tc>
         <w:tc>
@@ -671,6 +731,13 @@
                 <w:szCs w:val="18"/>
               </w:rPr>
             </w:pPr>
+            <w:r>
+              <w:rPr>
+                <w:sz w:val="18"/>
+                <w:szCs w:val="18"/>
+              </w:rPr>
+              <w:t>N/A</w:t>
+            </w:r>
           </w:p>
         </w:tc>
         <w:tc>
@@ -685,6 +752,13 @@
                 <w:szCs w:val="18"/>
               </w:rPr>
             </w:pPr>
+            <w:r>
+              <w:rPr>
+                <w:sz w:val="18"/>
+                <w:szCs w:val="18"/>
+              </w:rPr>
+              <w:t>No AI used this week</w:t>
+            </w:r>
           </w:p>
         </w:tc>
       </w:tr>
@@ -706,7 +780,14 @@
                 <w:sz w:val="18"/>
                 <w:szCs w:val="18"/>
               </w:rPr>
-              <w:t>Week 12</w:t>
+              <w:t xml:space="preserve">Week </w:t>
+            </w:r>
+            <w:r>
+              <w:rPr>
+                <w:sz w:val="18"/>
+                <w:szCs w:val="18"/>
+              </w:rPr>
+              <w:t>6</w:t>
             </w:r>
           </w:p>
         </w:tc>
@@ -743,6 +824,13 @@
                 <w:szCs w:val="18"/>
               </w:rPr>
             </w:pPr>
+            <w:r>
+              <w:rPr>
+                <w:sz w:val="18"/>
+                <w:szCs w:val="18"/>
+              </w:rPr>
+              <w:t>N/A</w:t>
+            </w:r>
           </w:p>
         </w:tc>
         <w:tc>
@@ -757,6 +845,13 @@
                 <w:szCs w:val="18"/>
               </w:rPr>
             </w:pPr>
+            <w:r>
+              <w:rPr>
+                <w:sz w:val="18"/>
+                <w:szCs w:val="18"/>
+              </w:rPr>
+              <w:t>N/A</w:t>
+            </w:r>
           </w:p>
         </w:tc>
         <w:tc>
@@ -771,6 +866,13 @@
                 <w:szCs w:val="18"/>
               </w:rPr>
             </w:pPr>
+            <w:r>
+              <w:rPr>
+                <w:sz w:val="18"/>
+                <w:szCs w:val="18"/>
+              </w:rPr>
+              <w:t>No AI used this week</w:t>
+            </w:r>
           </w:p>
         </w:tc>
       </w:tr>
@@ -1419,7 +1521,6 @@
   <w:style w:type="character" w:default="1" w:styleId="DefaultParagraphFont">
     <w:name w:val="Default Paragraph Font"/>
     <w:uiPriority w:val="1"/>
-    <w:semiHidden/>
     <w:unhideWhenUsed/>
   </w:style>
   <w:style w:type="table" w:default="1" w:styleId="TableNormal">

</xml_diff>

<commit_message>
Update report documentation for clarity and add translation notes
</commit_message>
<xml_diff>
--- a/40488199/40488199_GenAi_Log.docx
+++ b/40488199/40488199_GenAi_Log.docx
@@ -46,17 +46,8 @@
                 <w:sz w:val="18"/>
                 <w:szCs w:val="18"/>
               </w:rPr>
-              <w:t xml:space="preserve">Date / </w:t>
-            </w:r>
-            <w:proofErr w:type="spellStart"/>
-            <w:r>
-              <w:rPr>
-                <w:sz w:val="18"/>
-                <w:szCs w:val="18"/>
-              </w:rPr>
-              <w:t>Wk</w:t>
-            </w:r>
-            <w:proofErr w:type="spellEnd"/>
+              <w:t>Date / Wk</w:t>
+            </w:r>
           </w:p>
         </w:tc>
         <w:tc>
@@ -1112,39 +1103,7 @@
                 <w:sz w:val="18"/>
                 <w:szCs w:val="18"/>
               </w:rPr>
-              <w:t xml:space="preserve">As we have big </w:t>
-            </w:r>
-            <w:proofErr w:type="spellStart"/>
-            <w:r>
-              <w:rPr>
-                <w:sz w:val="18"/>
-                <w:szCs w:val="18"/>
-              </w:rPr>
-              <w:t>db</w:t>
-            </w:r>
-            <w:proofErr w:type="spellEnd"/>
-            <w:r>
-              <w:rPr>
-                <w:sz w:val="18"/>
-                <w:szCs w:val="18"/>
-              </w:rPr>
-              <w:t xml:space="preserve"> schema it would take a while to hardcode data in it so we were looking for other ways to put the data in </w:t>
-            </w:r>
-            <w:proofErr w:type="spellStart"/>
-            <w:r>
-              <w:rPr>
-                <w:sz w:val="18"/>
-                <w:szCs w:val="18"/>
-              </w:rPr>
-              <w:t>db</w:t>
-            </w:r>
-            <w:proofErr w:type="spellEnd"/>
-            <w:r>
-              <w:rPr>
-                <w:sz w:val="18"/>
-                <w:szCs w:val="18"/>
-              </w:rPr>
-              <w:t xml:space="preserve">, I found out approaches with scripts and chose the set based seeding with the number table as it keep room for developing project despite using loops that takes too much time if too much records, the team said that it makes </w:t>
+              <w:t xml:space="preserve">As we have big db schema it would take a while to hardcode data in it so we were looking for other ways to put the data in db, I found out approaches with scripts and chose the set based seeding with the number table as it keep room for developing project despite using loops that takes too much time if too much records, the team said that it makes </w:t>
             </w:r>
             <w:r>
               <w:rPr>
@@ -1240,23 +1199,7 @@
                 <w:sz w:val="18"/>
                 <w:szCs w:val="18"/>
               </w:rPr>
-              <w:t xml:space="preserve">Examples </w:t>
-            </w:r>
-            <w:proofErr w:type="spellStart"/>
-            <w:r>
-              <w:rPr>
-                <w:sz w:val="18"/>
-                <w:szCs w:val="18"/>
-              </w:rPr>
-              <w:t>to</w:t>
-            </w:r>
-            <w:proofErr w:type="spellEnd"/>
-            <w:r>
-              <w:rPr>
-                <w:sz w:val="18"/>
-                <w:szCs w:val="18"/>
-              </w:rPr>
-              <w:t xml:space="preserve"> deep in knowledge of using window in JS and arrow function and other variables </w:t>
+              <w:t xml:space="preserve">Examples to deep in knowledge of using window in JS and arrow function and other variables </w:t>
             </w:r>
           </w:p>
         </w:tc>
@@ -1352,7 +1295,7 @@
                 <w:sz w:val="18"/>
                 <w:szCs w:val="18"/>
               </w:rPr>
-              <w:t>N/A</w:t>
+              <w:t>Translation</w:t>
             </w:r>
           </w:p>
         </w:tc>
@@ -1373,7 +1316,7 @@
                 <w:sz w:val="18"/>
                 <w:szCs w:val="18"/>
               </w:rPr>
-              <w:t>N/A</w:t>
+              <w:t>Translation for comments to reports</w:t>
             </w:r>
           </w:p>
         </w:tc>
@@ -1394,7 +1337,7 @@
                 <w:sz w:val="18"/>
                 <w:szCs w:val="18"/>
               </w:rPr>
-              <w:t>No AI used this week</w:t>
+              <w:t>I ask Ai help to translate from my native language what I want to comment</w:t>
             </w:r>
           </w:p>
         </w:tc>
@@ -2044,6 +1987,7 @@
   <w:style w:type="character" w:default="1" w:styleId="DefaultParagraphFont">
     <w:name w:val="Default Paragraph Font"/>
     <w:uiPriority w:val="1"/>
+    <w:semiHidden/>
     <w:unhideWhenUsed/>
   </w:style>
   <w:style w:type="table" w:default="1" w:styleId="TableNormal">

</xml_diff>